<commit_message>
docs: modificacion final informe
</commit_message>
<xml_diff>
--- a/Informe Git  - Damian Escobar.docx
+++ b/Informe Git  - Damian Escobar.docx
@@ -421,7 +421,6 @@
           <w:numId w:val="2"/>
         </w:numPr>
         <w:spacing w:after="160" w:line="259" w:lineRule="auto"/>
-        <w:ind w:left="720"/>
         <w:rPr>
           <w:sz w:val="20"/>
           <w:szCs w:val="20"/>
@@ -471,7 +470,6 @@
           <w:numId w:val="2"/>
         </w:numPr>
         <w:spacing w:after="160" w:line="259" w:lineRule="auto"/>
-        <w:ind w:left="720"/>
         <w:rPr>
           <w:sz w:val="20"/>
           <w:szCs w:val="20"/>
@@ -503,7 +501,6 @@
           <w:numId w:val="2"/>
         </w:numPr>
         <w:spacing w:after="160" w:line="259" w:lineRule="auto"/>
-        <w:ind w:left="720"/>
         <w:rPr>
           <w:sz w:val="20"/>
           <w:szCs w:val="20"/>
@@ -547,7 +544,6 @@
           <w:numId w:val="2"/>
         </w:numPr>
         <w:spacing w:after="160" w:line="259" w:lineRule="auto"/>
-        <w:ind w:left="720"/>
         <w:rPr>
           <w:sz w:val="20"/>
           <w:szCs w:val="20"/>
@@ -597,7 +593,6 @@
           <w:numId w:val="2"/>
         </w:numPr>
         <w:spacing w:after="160" w:line="259" w:lineRule="auto"/>
-        <w:ind w:left="720"/>
         <w:rPr>
           <w:sz w:val="20"/>
           <w:szCs w:val="20"/>
@@ -638,10 +633,6 @@
     </w:p>
     <w:p>
       <w:pPr>
-        <w:numPr>
-          <w:ilvl w:val="0"/>
-          <w:numId w:val="3"/>
-        </w:numPr>
         <w:spacing w:after="160" w:line="259" w:lineRule="auto"/>
         <w:ind w:left="720"/>
         <w:rPr>
@@ -650,6 +641,14 @@
           <w:szCs w:val="22"/>
         </w:rPr>
       </w:pPr>
+      <w:r>
+        <w:rPr>
+          <w:rFonts w:ascii="Arial" w:eastAsia="Arial" w:hAnsi="Arial" w:cs="Arial"/>
+          <w:sz w:val="22"/>
+          <w:szCs w:val="22"/>
+        </w:rPr>
+        <w:t xml:space="preserve">1. </w:t>
+      </w:r>
       <w:proofErr w:type="spellStart"/>
       <w:r>
         <w:rPr>
@@ -689,10 +688,6 @@
     </w:p>
     <w:p>
       <w:pPr>
-        <w:numPr>
-          <w:ilvl w:val="0"/>
-          <w:numId w:val="3"/>
-        </w:numPr>
         <w:spacing w:after="160" w:line="259" w:lineRule="auto"/>
         <w:ind w:left="720"/>
         <w:rPr>
@@ -701,6 +696,14 @@
           <w:szCs w:val="22"/>
         </w:rPr>
       </w:pPr>
+      <w:r>
+        <w:rPr>
+          <w:rFonts w:ascii="Arial" w:eastAsia="Arial" w:hAnsi="Arial" w:cs="Arial"/>
+          <w:sz w:val="22"/>
+          <w:szCs w:val="22"/>
+        </w:rPr>
+        <w:t xml:space="preserve">2. </w:t>
+      </w:r>
       <w:proofErr w:type="spellStart"/>
       <w:r>
         <w:rPr>
@@ -758,10 +761,6 @@
     </w:p>
     <w:p>
       <w:pPr>
-        <w:numPr>
-          <w:ilvl w:val="0"/>
-          <w:numId w:val="3"/>
-        </w:numPr>
         <w:spacing w:after="160" w:line="259" w:lineRule="auto"/>
         <w:ind w:left="720"/>
         <w:rPr>
@@ -770,6 +769,14 @@
           <w:szCs w:val="22"/>
         </w:rPr>
       </w:pPr>
+      <w:r>
+        <w:rPr>
+          <w:rFonts w:ascii="Arial" w:eastAsia="Arial" w:hAnsi="Arial" w:cs="Arial"/>
+          <w:sz w:val="22"/>
+          <w:szCs w:val="22"/>
+        </w:rPr>
+        <w:t xml:space="preserve">3. </w:t>
+      </w:r>
       <w:proofErr w:type="spellStart"/>
       <w:r>
         <w:rPr>
@@ -788,6 +795,7 @@
         </w:rPr>
         <w:t xml:space="preserve"> </w:t>
       </w:r>
+      <w:proofErr w:type="spellStart"/>
       <w:proofErr w:type="gramStart"/>
       <w:r>
         <w:rPr>
@@ -795,7 +803,16 @@
           <w:sz w:val="22"/>
           <w:szCs w:val="22"/>
         </w:rPr>
-        <w:t>add .</w:t>
+        <w:t>add</w:t>
+      </w:r>
+      <w:proofErr w:type="spellEnd"/>
+      <w:r>
+        <w:rPr>
+          <w:rFonts w:ascii="Arial" w:eastAsia="Arial" w:hAnsi="Arial" w:cs="Arial"/>
+          <w:sz w:val="22"/>
+          <w:szCs w:val="22"/>
+        </w:rPr>
+        <w:t xml:space="preserve"> .</w:t>
       </w:r>
       <w:proofErr w:type="gramEnd"/>
       <w:r>
@@ -827,10 +844,6 @@
     </w:p>
     <w:p>
       <w:pPr>
-        <w:numPr>
-          <w:ilvl w:val="0"/>
-          <w:numId w:val="3"/>
-        </w:numPr>
         <w:spacing w:after="160" w:line="259" w:lineRule="auto"/>
         <w:ind w:left="720"/>
         <w:rPr>
@@ -839,6 +852,14 @@
           <w:szCs w:val="22"/>
         </w:rPr>
       </w:pPr>
+      <w:r>
+        <w:rPr>
+          <w:rFonts w:ascii="Arial" w:eastAsia="Arial" w:hAnsi="Arial" w:cs="Arial"/>
+          <w:sz w:val="22"/>
+          <w:szCs w:val="22"/>
+        </w:rPr>
+        <w:t xml:space="preserve">4. </w:t>
+      </w:r>
       <w:proofErr w:type="spellStart"/>
       <w:r>
         <w:rPr>
@@ -896,10 +917,6 @@
     </w:p>
     <w:p>
       <w:pPr>
-        <w:numPr>
-          <w:ilvl w:val="0"/>
-          <w:numId w:val="3"/>
-        </w:numPr>
         <w:spacing w:after="160" w:line="259" w:lineRule="auto"/>
         <w:ind w:left="720"/>
         <w:rPr>
@@ -908,6 +925,14 @@
           <w:szCs w:val="22"/>
         </w:rPr>
       </w:pPr>
+      <w:r>
+        <w:rPr>
+          <w:rFonts w:ascii="Arial" w:eastAsia="Arial" w:hAnsi="Arial" w:cs="Arial"/>
+          <w:sz w:val="22"/>
+          <w:szCs w:val="22"/>
+        </w:rPr>
+        <w:t xml:space="preserve">5. </w:t>
+      </w:r>
       <w:proofErr w:type="spellStart"/>
       <w:r>
         <w:rPr>
@@ -947,10 +972,6 @@
     </w:p>
     <w:p>
       <w:pPr>
-        <w:numPr>
-          <w:ilvl w:val="0"/>
-          <w:numId w:val="3"/>
-        </w:numPr>
         <w:spacing w:after="160" w:line="259" w:lineRule="auto"/>
         <w:ind w:left="720"/>
         <w:rPr>
@@ -959,6 +980,14 @@
           <w:szCs w:val="22"/>
         </w:rPr>
       </w:pPr>
+      <w:r>
+        <w:rPr>
+          <w:rFonts w:ascii="Arial" w:eastAsia="Arial" w:hAnsi="Arial" w:cs="Arial"/>
+          <w:sz w:val="22"/>
+          <w:szCs w:val="22"/>
+        </w:rPr>
+        <w:t xml:space="preserve">6. </w:t>
+      </w:r>
       <w:proofErr w:type="spellStart"/>
       <w:r>
         <w:rPr>
@@ -998,10 +1027,6 @@
     </w:p>
     <w:p>
       <w:pPr>
-        <w:numPr>
-          <w:ilvl w:val="0"/>
-          <w:numId w:val="3"/>
-        </w:numPr>
         <w:spacing w:after="160" w:line="259" w:lineRule="auto"/>
         <w:ind w:left="720"/>
         <w:rPr>
@@ -1010,6 +1035,14 @@
           <w:szCs w:val="22"/>
         </w:rPr>
       </w:pPr>
+      <w:r>
+        <w:rPr>
+          <w:rFonts w:ascii="Arial" w:eastAsia="Arial" w:hAnsi="Arial" w:cs="Arial"/>
+          <w:sz w:val="22"/>
+          <w:szCs w:val="22"/>
+        </w:rPr>
+        <w:t xml:space="preserve">7. </w:t>
+      </w:r>
       <w:proofErr w:type="spellStart"/>
       <w:r>
         <w:rPr>
@@ -1031,10 +1064,6 @@
     </w:p>
     <w:p>
       <w:pPr>
-        <w:numPr>
-          <w:ilvl w:val="0"/>
-          <w:numId w:val="3"/>
-        </w:numPr>
         <w:spacing w:after="160" w:line="259" w:lineRule="auto"/>
         <w:ind w:left="720"/>
         <w:rPr>
@@ -1043,7 +1072,6 @@
           <w:szCs w:val="22"/>
         </w:rPr>
       </w:pPr>
-      <w:proofErr w:type="spellStart"/>
       <w:r>
         <w:rPr>
           <w:rFonts w:ascii="Arial" w:eastAsia="Arial" w:hAnsi="Arial" w:cs="Arial"/>
@@ -1051,6 +1079,15 @@
           <w:szCs w:val="22"/>
         </w:rPr>
         <w:lastRenderedPageBreak/>
+        <w:t xml:space="preserve">8. </w:t>
+      </w:r>
+      <w:proofErr w:type="spellStart"/>
+      <w:r>
+        <w:rPr>
+          <w:rFonts w:ascii="Arial" w:eastAsia="Arial" w:hAnsi="Arial" w:cs="Arial"/>
+          <w:sz w:val="22"/>
+          <w:szCs w:val="22"/>
+        </w:rPr>
         <w:t>git</w:t>
       </w:r>
       <w:proofErr w:type="spellEnd"/>
@@ -1083,10 +1120,6 @@
     </w:p>
     <w:p>
       <w:pPr>
-        <w:numPr>
-          <w:ilvl w:val="0"/>
-          <w:numId w:val="3"/>
-        </w:numPr>
         <w:spacing w:after="160" w:line="259" w:lineRule="auto"/>
         <w:ind w:left="720"/>
         <w:rPr>
@@ -1095,6 +1128,14 @@
           <w:szCs w:val="22"/>
         </w:rPr>
       </w:pPr>
+      <w:r>
+        <w:rPr>
+          <w:rFonts w:ascii="Arial" w:eastAsia="Arial" w:hAnsi="Arial" w:cs="Arial"/>
+          <w:sz w:val="22"/>
+          <w:szCs w:val="22"/>
+        </w:rPr>
+        <w:t xml:space="preserve">9. </w:t>
+      </w:r>
       <w:proofErr w:type="spellStart"/>
       <w:r>
         <w:rPr>
@@ -1134,10 +1175,6 @@
     </w:p>
     <w:p>
       <w:pPr>
-        <w:numPr>
-          <w:ilvl w:val="0"/>
-          <w:numId w:val="3"/>
-        </w:numPr>
         <w:spacing w:after="160" w:line="259" w:lineRule="auto"/>
         <w:ind w:left="720"/>
         <w:rPr>
@@ -1146,23 +1183,21 @@
           <w:szCs w:val="22"/>
         </w:rPr>
       </w:pPr>
-      <w:proofErr w:type="spellStart"/>
-      <w:r>
-        <w:rPr>
-          <w:rFonts w:ascii="Arial" w:eastAsia="Arial" w:hAnsi="Arial" w:cs="Arial"/>
-          <w:sz w:val="22"/>
-          <w:szCs w:val="22"/>
-        </w:rPr>
-        <w:t>git</w:t>
-      </w:r>
-      <w:proofErr w:type="spellEnd"/>
-      <w:r>
-        <w:rPr>
-          <w:rFonts w:ascii="Arial" w:eastAsia="Arial" w:hAnsi="Arial" w:cs="Arial"/>
-          <w:sz w:val="22"/>
-          <w:szCs w:val="22"/>
-        </w:rPr>
-        <w:t xml:space="preserve"> </w:t>
+      <w:r>
+        <w:rPr>
+          <w:rFonts w:ascii="Arial" w:eastAsia="Arial" w:hAnsi="Arial" w:cs="Arial"/>
+          <w:sz w:val="22"/>
+          <w:szCs w:val="22"/>
+        </w:rPr>
+        <w:t xml:space="preserve">10. </w:t>
+      </w:r>
+      <w:r>
+        <w:rPr>
+          <w:rFonts w:ascii="Arial" w:eastAsia="Arial" w:hAnsi="Arial" w:cs="Arial"/>
+          <w:sz w:val="22"/>
+          <w:szCs w:val="22"/>
+        </w:rPr>
+        <w:t xml:space="preserve">git </w:t>
       </w:r>
       <w:proofErr w:type="spellStart"/>
       <w:r>
@@ -2383,7 +2418,7 @@
       <w:lvlText w:val="●"/>
       <w:lvlJc w:val="left"/>
       <w:pPr>
-        <w:ind w:left="360" w:hanging="360"/>
+        <w:ind w:left="720" w:hanging="360"/>
       </w:pPr>
       <w:rPr>
         <w:rFonts w:ascii="Noto Sans Symbols" w:eastAsia="Noto Sans Symbols" w:hAnsi="Noto Sans Symbols" w:cs="Noto Sans Symbols"/>
@@ -3170,6 +3205,7 @@
   <w:style w:type="character" w:default="1" w:styleId="Fuentedeprrafopredeter">
     <w:name w:val="Default Paragraph Font"/>
     <w:uiPriority w:val="1"/>
+    <w:semiHidden/>
     <w:unhideWhenUsed/>
   </w:style>
   <w:style w:type="table" w:default="1" w:styleId="Tablanormal">

</xml_diff>